<commit_message>
additional figures and tables
</commit_message>
<xml_diff>
--- a/code/tables/table5a_period_summary.docx
+++ b/code/tables/table5a_period_summary.docx
@@ -65,7 +65,7 @@
           <w:sz w:val="20"/>
           <w:color w:val="333333"/>
         </w:rPr>
-        <w:t xml:space="default">Upstream Trail Creek ISCO (peak flow: 5/14/2026)</w:t>
+        <w:t xml:space="default">Upstream and Downstream Trail Creek ISCO (peak flow: 5/14/2026)</w:t>
       </w:r>
     </w:p>
     <w:tbl xmlns:w="http://schemas.openxmlformats.org/wordprocessingml/2006/main" xmlns:wp="http://schemas.openxmlformats.org/drawingml/2006/wordprocessingDrawing" xmlns:r="http://schemas.openxmlformats.org/officeDocument/2006/relationships" xmlns:w14="http://schemas.microsoft.com/office/word/2010/wordml">
@@ -246,7 +246,7 @@
                 <w:rFonts w:ascii="Calibri" w:hAnsi="Calibri"/>
                 <w:sz w:val="20"/>
               </w:rPr>
-              <w:t xml:space="default">28</w:t>
+              <w:t xml:space="default">62</w:t>
             </w:r>
           </w:p>
         </w:tc>
@@ -270,7 +270,7 @@
                 <w:rFonts w:ascii="Calibri" w:hAnsi="Calibri"/>
                 <w:sz w:val="20"/>
               </w:rPr>
-              <w:t xml:space="default">-1.998</w:t>
+              <w:t xml:space="default">-2.980</w:t>
             </w:r>
           </w:p>
         </w:tc>
@@ -294,7 +294,7 @@
                 <w:rFonts w:ascii="Calibri" w:hAnsi="Calibri"/>
                 <w:sz w:val="20"/>
               </w:rPr>
-              <w:t xml:space="default">0.771</w:t>
+              <w:t xml:space="default">1.739</w:t>
             </w:r>
           </w:p>
         </w:tc>
@@ -318,7 +318,7 @@
                 <w:rFonts w:ascii="Calibri" w:hAnsi="Calibri"/>
                 <w:sz w:val="20"/>
               </w:rPr>
-              <w:t xml:space="default">-2.017</w:t>
+              <w:t xml:space="default">-2.458</w:t>
             </w:r>
           </w:p>
         </w:tc>
@@ -371,7 +371,7 @@
                 <w:rFonts w:ascii="Calibri" w:hAnsi="Calibri"/>
                 <w:sz w:val="20"/>
               </w:rPr>
-              <w:t xml:space="default">12</w:t>
+              <w:t xml:space="default">24</w:t>
             </w:r>
           </w:p>
         </w:tc>
@@ -395,7 +395,7 @@
                 <w:rFonts w:ascii="Calibri" w:hAnsi="Calibri"/>
                 <w:sz w:val="20"/>
               </w:rPr>
-              <w:t xml:space="default">-0.567</w:t>
+              <w:t xml:space="default">-0.727</w:t>
             </w:r>
           </w:p>
         </w:tc>
@@ -419,7 +419,7 @@
                 <w:rFonts w:ascii="Calibri" w:hAnsi="Calibri"/>
                 <w:sz w:val="20"/>
               </w:rPr>
-              <w:t xml:space="default">0.333</w:t>
+              <w:t xml:space="default">0.352</w:t>
             </w:r>
           </w:p>
         </w:tc>
@@ -443,7 +443,7 @@
                 <w:rFonts w:ascii="Calibri" w:hAnsi="Calibri"/>
                 <w:sz w:val="20"/>
               </w:rPr>
-              <w:t xml:space="default">-0.542</w:t>
+              <w:t xml:space="default">-0.734</w:t>
             </w:r>
           </w:p>
         </w:tc>

</xml_diff>